<commit_message>
RPL: perkuat landasan teori - sitasi UNISDR 2009, UU 24/2007, Tandel & Jamadar 2018 (12 referensi)
</commit_message>
<xml_diff>
--- a/Proposal_RPL_GeoSiaga.docx
+++ b/Proposal_RPL_GeoSiaga.docx
@@ -7422,6 +7422,10 @@
         </w:rPr>
         <w:t>Data real-time adalah data yang disajikan pada saat terjadinya peristiwa atau segera setelah peristiwa terjadi, sehingga selisih waktu antara kejadian dan penyajian data sangat kecil. Pertukaran data antar sistem pada umumnya dilakukan melalui REST API (Representational State Transfer Application Programming Interface), yaitu antarmuka berbasis web yang memungkinkan sebuah sistem mengambil data dari sistem lain melalui protokol HTTP (Fielding, 2000). GeoSiaga menggunakan pendekatan ini untuk menarik data dari API resmi BMKG, NASA FIRMS, PVMBG/MAGMA ESDM, dan Open-Meteo.</w:t>
       </w:r>
+      <w:r>
+        <w:rPr/>
+        <w:t xml:space="preserve"> Gaya arsitektur REST diperkenalkan oleh Fielding (2000) sebagai gaya arsitektur perangkat lunak berbasis jaringan yang memanfaatkan protokol HTTP secara sederhana dan tanpa status.</w:t>
+      </w:r>
     </w:p>
     <w:p>
       <w:pPr>
@@ -7441,6 +7445,10 @@
         </w:rPr>
         <w:t>Pemantauan lingkungan dan bencana berkaitan erat dengan sistem peringatan dini, yaitu serangkaian kemampuan yang memungkinkan pemerintah dan masyarakat memperoleh informasi akan ancaman bencana secara tepat waktu sehingga dapat mengambil tindakan pengurangan risiko. BMKG menyediakan data gempa bumi dan prakiraan cuaca resmi, PVMBG menetapkan level aktivitas gunung api (Level I hingga IV), dan NASA FIRMS mendeteksi titik panas kebakaran hutan dan lahan melalui satelit. Data-data inilah yang menjadi sumber utama sistem yang dirancang.</w:t>
       </w:r>
+      <w:r>
+        <w:rPr/>
+        <w:t xml:space="preserve"> Sistem peringatan dini merupakan rangkaian kemampuan yang diperlukan untuk memperoleh informasi ancaman secara tepat waktu agar tindakan pengurangan risiko dapat diambil (UNISDR, 2009). Di Indonesia, penyelenggaraan penanggulangan bencana termasuk peringatan dini mengacu pada Undang-Undang Nomor 24 Tahun 2007 tentang Penanggulangan Bencana, yang menempatkan kegiatan prabencana, tanggap darurat, dan pascabencana sebagai satu kesatuan penyelenggaraan (Republik Indonesia, 2007).</w:t>
+      </w:r>
     </w:p>
     <w:p>
       <w:pPr>
@@ -7478,6 +7486,10 @@
           <w:b w:val="0"/>
         </w:rPr>
         <w:t>Progressive Web App (PWA) adalah pendekatan pengembangan aplikasi web yang memberikan pengalaman seperti aplikasi native, di antaranya melalui service worker yang menyimpan cache agar aplikasi tetap dapat diakses pada jaringan lambat. Pendekatan ini dipilih agar GeoSiaga tetap ringan diakses di daerah dengan keterbatasan jaringan.</w:t>
+      </w:r>
+      <w:r>
+        <w:rPr/>
+        <w:t xml:space="preserve"> Kajian Tandel dan Jamadar (2018) menunjukkan bahwa PWA mampu memangkas ukuran unduhan dibandingkan aplikasi native dan memanfaatkan mekanisme cache service worker sehingga aplikasi tetap terbuka saat koneksi tidak stabil, hal ini menjadi dasar pemilihan PWA pada penelitian ini.</w:t>
       </w:r>
     </w:p>
     <w:p>
@@ -8380,7 +8392,46 @@
         </w:rPr>
       </w:pPr>
       <w:r>
+        <w:t>Republik Indonesia. (2007). Undang-Undang Nomor 24 Tahun 2007 tentang Penanggulangan Bencana. Jakarta: Sekretariat Negara.</w:t>
+      </w:r>
+    </w:p>
+    <w:p>
+      <w:pPr>
+        <w:spacing w:after="40" w:line="240" w:lineRule="auto"/>
+        <w:ind w:left="720" w:hanging="720"/>
+        <w:rPr>
+          <w:color w:val="000000"/>
+          <w:szCs w:val="24"/>
+        </w:rPr>
+      </w:pPr>
+      <w:r>
         <w:t>Susanto, A., Prabowo, A. S., Kategan, A., &amp; Majid, A. D. (2022). Sistem Informasi Geografis Pemetaan Daerah Rawan Bencana di Kabupaten Musi Rawas. Infotekmesin, 13(1), 118-123.</w:t>
+      </w:r>
+    </w:p>
+    <w:p>
+      <w:pPr>
+        <w:spacing w:after="40" w:line="240" w:lineRule="auto"/>
+        <w:ind w:left="720" w:hanging="720"/>
+        <w:rPr>
+          <w:color w:val="000000"/>
+          <w:szCs w:val="24"/>
+        </w:rPr>
+      </w:pPr>
+      <w:r>
+        <w:t>Tandel, S., &amp; Jamadar, A. (2018). Impact of Progressive Web Apps on Web App Development. International Journal of Innovative Research in Science, Engineering and Technology, 7(9). https://doi.org/10.15680/IJIRSET.2018.0709021</w:t>
+      </w:r>
+    </w:p>
+    <w:p>
+      <w:pPr>
+        <w:spacing w:after="40" w:line="240" w:lineRule="auto"/>
+        <w:ind w:left="720" w:hanging="720"/>
+        <w:rPr>
+          <w:color w:val="000000"/>
+          <w:szCs w:val="24"/>
+        </w:rPr>
+      </w:pPr>
+      <w:r>
+        <w:t>UNISDR. (2009). 2009 UNISDR Terminology on Disaster Risk Reduction. Geneva: United Nations International Strategy for Disaster Reduction.</w:t>
       </w:r>
     </w:p>
     <w:p>

</xml_diff>